<commit_message>
Hindcast-Seite /diagnose/: Modellverifikation an gefahrenen Strecken
Eigene Seite neben der Vorhersage (gleicher Build, gleicher Pförtner-Vhost),
Petrol statt Blau, gegenseitig verlinkt. GPX-Track (Zeit + Höhe) gegen die
reine Modellwind-Trajektorie mit D2/EU/Global, Rechenkern wie die Vorhersage
(WindField + neues computeAlongProfile: Zielhöhe folgt dem GPS-Profil,
Lücken auf 30 s unterteilt, Petterssen bis 0,1 m). Archivtiefe je Modell
live per past_days=92. Kennzahlen, Zeitschieber, Diagramme, CSV-Export.

README überarbeitet (Bedienung auf aktuellem Stand: Rechtsklick-Startpunkt,
Zeitband, Höhenbalken, Trajektorienverlauf statt Querschnitt, Einstellungen,
Exportformate; meteokit-Importe und Build-Pflicht korrigiert).
Bedienungsanleitung 8.3 und Physik-Dokument 8.3 ergänzt.

Co-Authored-By: Claude Opus 5.5 <noreply@anthropic.com>
</commit_message>
<xml_diff>
--- a/docs/Bedienungsanleitung-Windtrajektorien.docx
+++ b/docs/Bedienungsanleitung-Windtrajektorien.docx
@@ -3555,6 +3555,227 @@
       </w:r>
       <w:r>
         <w:t xml:space="preserve"> löscht sie wieder.</w:t>
+      </w:r>
+    </w:p>
+    <w:p>
+      <w:pPr>
+        <w:pStyle w:val="Heading2"/>
+      </w:pPr>
+      <w:r>
+        <w:t xml:space="preserve">8.3 Gefahrene Strecke überprüfen (Hindcast)</w:t>
+      </w:r>
+    </w:p>
+    <w:p>
+      <w:pPr>
+        <w:spacing w:after="120"/>
+      </w:pPr>
+      <w:r>
+        <w:t xml:space="preserve">Wie gut hat das Modell den Wind einer tatsächlichen Fahrt getroffen? Dafür gibt es eine eigene Seite: der </w:t>
+      </w:r>
+      <w:r>
+        <w:rPr>
+          <w:b/>
+          <w:bCs/>
+        </w:rPr>
+        <w:t xml:space="preserve">Hindcast</w:t>
+      </w:r>
+      <w:r>
+        <w:t xml:space="preserve">. Sie öffnen ihn über den kleinen grünen Knopf </w:t>
+      </w:r>
+      <w:r>
+        <w:rPr>
+          <w:b/>
+          <w:bCs/>
+          <w:color w:val="0F6B63"/>
+        </w:rPr>
+        <w:t xml:space="preserve">„Hindcast“</w:t>
+      </w:r>
+      <w:r>
+        <w:t xml:space="preserve"> oben im Bedienfeld oder über den Link in der Fußzeile. Die Seite sieht ähnlich aus wie die Vorhersage, ist aber durchgehend petrolgrün statt blau, damit man die beiden nicht verwechselt. Mit </w:t>
+      </w:r>
+      <w:r>
+        <w:rPr>
+          <w:b/>
+          <w:bCs/>
+          <w:color w:val="0F6B63"/>
+        </w:rPr>
+        <w:t xml:space="preserve">„→ Vorhersage“</w:t>
+      </w:r>
+      <w:r>
+        <w:t xml:space="preserve"> kommen Sie zurück.</w:t>
+      </w:r>
+    </w:p>
+    <w:p>
+      <w:pPr>
+        <w:spacing w:after="120"/>
+      </w:pPr>
+      <w:r>
+        <w:t xml:space="preserve">So gehen Sie vor:</w:t>
+      </w:r>
+    </w:p>
+    <w:p>
+      <w:pPr>
+        <w:pStyle w:val="ListParagraph"/>
+        <w:numPr>
+          <w:ilvl w:val="0"/>
+          <w:numId w:val="2"/>
+        </w:numPr>
+        <w:spacing w:after="60"/>
+      </w:pPr>
+      <w:r>
+        <w:rPr>
+          <w:b/>
+          <w:bCs/>
+        </w:rPr>
+        <w:t xml:space="preserve">Track laden:</w:t>
+      </w:r>
+      <w:r>
+        <w:t xml:space="preserve"> Ziehen Sie die GPX-Datei Ihrer Fahrt auf das Feld </w:t>
+      </w:r>
+      <w:r>
+        <w:rPr>
+          <w:b/>
+          <w:bCs/>
+          <w:color w:val="0F6B63"/>
+        </w:rPr>
+        <w:t xml:space="preserve">„GPX-Track laden“</w:t>
+      </w:r>
+      <w:r>
+        <w:t xml:space="preserve"> (oder auf die Karte) oder wählen Sie sie dort aus. Der Track braucht Zeit und Höhe je Punkt, wie ihn jedes GPS-Gerät und jede Tracking-App aufzeichnet. Die Datei bleibt auf Ihrem Gerät, sie wird nicht hochgeladen.</w:t>
+      </w:r>
+    </w:p>
+    <w:p>
+      <w:pPr>
+        <w:pStyle w:val="ListParagraph"/>
+        <w:numPr>
+          <w:ilvl w:val="0"/>
+          <w:numId w:val="2"/>
+        </w:numPr>
+        <w:spacing w:after="60"/>
+      </w:pPr>
+      <w:r>
+        <w:rPr>
+          <w:b/>
+          <w:bCs/>
+        </w:rPr>
+        <w:t xml:space="preserve">Fahrtabschnitt prüfen:</w:t>
+      </w:r>
+      <w:r>
+        <w:t xml:space="preserve"> </w:t>
+      </w:r>
+      <w:r>
+        <w:rPr>
+          <w:b/>
+          <w:bCs/>
+          <w:color w:val="0F6B63"/>
+        </w:rPr>
+        <w:t xml:space="preserve">„Beginn“</w:t>
+      </w:r>
+      <w:r>
+        <w:t xml:space="preserve"> und </w:t>
+      </w:r>
+      <w:r>
+        <w:rPr>
+          <w:b/>
+          <w:bCs/>
+          <w:color w:val="0F6B63"/>
+        </w:rPr>
+        <w:t xml:space="preserve">„Ende“</w:t>
+      </w:r>
+      <w:r>
+        <w:t xml:space="preserve"> (UTC) sind auf Start und Landung vorbelegt. Ändern Sie sie, wenn die Erkennung nicht passt, etwa weil der Logger schon beim Aufrüsten lief.</w:t>
+      </w:r>
+    </w:p>
+    <w:p>
+      <w:pPr>
+        <w:pStyle w:val="ListParagraph"/>
+        <w:numPr>
+          <w:ilvl w:val="0"/>
+          <w:numId w:val="2"/>
+        </w:numPr>
+        <w:spacing w:after="60"/>
+      </w:pPr>
+      <w:r>
+        <w:rPr>
+          <w:b/>
+          <w:bCs/>
+        </w:rPr>
+        <w:t xml:space="preserve">Modelle wählen:</w:t>
+      </w:r>
+      <w:r>
+        <w:t xml:space="preserve"> ICON-D2, ICON-EU und ICON Global können einzeln oder gemeinsam gerechnet werden. Neben jedem Modell steht, ab wann der Server Daten hat. Ältere Fahrten lassen sich nicht mehr prüfen, ein Modell ist dann ausgegraut, mit dem Grund daneben. Das Archiv reicht derzeit rund zwei Wochen zurück.</w:t>
+      </w:r>
+    </w:p>
+    <w:p>
+      <w:pPr>
+        <w:pStyle w:val="ListParagraph"/>
+        <w:numPr>
+          <w:ilvl w:val="0"/>
+          <w:numId w:val="2"/>
+        </w:numPr>
+        <w:spacing w:after="60"/>
+      </w:pPr>
+      <w:r>
+        <w:rPr>
+          <w:b/>
+          <w:bCs/>
+        </w:rPr>
+        <w:t xml:space="preserve">Berechnen:</w:t>
+      </w:r>
+      <w:r>
+        <w:t xml:space="preserve"> </w:t>
+      </w:r>
+      <w:r>
+        <w:rPr>
+          <w:b/>
+          <w:bCs/>
+          <w:color w:val="0F6B63"/>
+        </w:rPr>
+        <w:t xml:space="preserve">„Diagnose berechnen“</w:t>
+      </w:r>
+      <w:r>
+        <w:t xml:space="preserve"> startet die Rechnung, ein erneuter Klick bricht sie ab.</w:t>
+      </w:r>
+    </w:p>
+    <w:p>
+      <w:pPr>
+        <w:spacing w:after="120"/>
+      </w:pPr>
+      <w:r>
+        <w:t xml:space="preserve">Ergebnis: Auf der Karte liegt Ihr GPS-Track als dunkle durchgezogene Linie, die Modellspuren gestrichelt in der Farbe des Modells. Jede Modellspur startet an Ihrem Startpunkt und fährt mit denselben Zeiten und Höhen wie Sie, aber nur mit dem Modellwind. Je näher sie an Ihrem Track bleibt, desto besser war das Modell. Die Tabelle </w:t>
+      </w:r>
+      <w:r>
+        <w:rPr>
+          <w:b/>
+          <w:bCs/>
+          <w:color w:val="0F6B63"/>
+        </w:rPr>
+        <w:t xml:space="preserve">„Vergleich“</w:t>
+      </w:r>
+      <w:r>
+        <w:t xml:space="preserve"> nennt die Ablage am Ende und im Mittel sowie den Windfehler. Mit dem Schieber </w:t>
+      </w:r>
+      <w:r>
+        <w:rPr>
+          <w:b/>
+          <w:bCs/>
+          <w:color w:val="0F6B63"/>
+        </w:rPr>
+        <w:t xml:space="preserve">„Zeitpunkt“</w:t>
+      </w:r>
+      <w:r>
+        <w:t xml:space="preserve"> gehen Sie die Fahrt durch und sehen für jeden Moment Ihre Geschwindigkeit, den Modellwind und den Abstand. Darunter zeigen drei Diagramme Abstand, Geschwindigkeit und Richtung über die Zeit. </w:t>
+      </w:r>
+      <w:r>
+        <w:rPr>
+          <w:b/>
+          <w:bCs/>
+          <w:color w:val="0F6B63"/>
+        </w:rPr>
+        <w:t xml:space="preserve">„Ergebnis als CSV herunterladen“</w:t>
+      </w:r>
+      <w:r>
+        <w:t xml:space="preserve"> speichert alle Werte für eine Tabellenkalkulation.</w:t>
       </w:r>
     </w:p>
     <w:p>

</xml_diff>

<commit_message>
GRAMET: Umschalter Zeit | Strecke, Doku
Übergibt die gespeicherte X-Achsen-Wahl und die kumulierte Strecke je
Wegpunkt (profile.dist) an <gramet-panel>, damit die Strecken-Achse der
echten Trajektorie folgt. README und Bedienungsanleitung (6.2) um den
Umschalter und das Ende am Vorhersagezeitraum ergänzt.

Co-Authored-By: Claude Opus 5.5 <noreply@anthropic.com>
</commit_message>
<xml_diff>
--- a/docs/Bedienungsanleitung-Windtrajektorien.docx
+++ b/docs/Bedienungsanleitung-Windtrajektorien.docx
@@ -2914,7 +2914,7 @@
         <w:t xml:space="preserve">GRAMET</w:t>
       </w:r>
       <w:r>
-        <w:t xml:space="preserve"> ist ein Wetterquerschnitt entlang des Weges, wie er in der Luftfahrt verwendet wird. Die x-Achse ist die verstrichene Zeit, die y-Achse die Höhe. Jede Spalte zeigt das Wetter an dem Ort, an dem sich die Trajektorie zu dieser Zeit befindet:</w:t>
+        <w:t xml:space="preserve"> ist ein Wetterquerschnitt entlang des Weges, wie er in der Luftfahrt verwendet wird. Die x-Achse ist standardmäßig die verstrichene Zeit (umschaltbar auf die zurückgelegte Strecke, s. u.), die y-Achse die Höhe. Jede Spalte zeigt das Wetter an dem Ort, an dem sich die Trajektorie zu dieser Zeit befindet:</w:t>
       </w:r>
     </w:p>
     <w:p>
@@ -2996,7 +2996,26 @@
         <w:t xml:space="preserve">„Um die Trajektorie“</w:t>
       </w:r>
       <w:r>
-        <w:t xml:space="preserve"> (gezoomt) umschalten.</w:t>
+        <w:t xml:space="preserve"> (gezoomt) umschalten. Daneben schaltet </w:t>
+      </w:r>
+      <w:r>
+        <w:rPr>
+          <w:b/>
+          <w:bCs/>
+          <w:color w:val="1C5CAB"/>
+        </w:rPr>
+        <w:t xml:space="preserve">„Zeit | Strecke“</w:t>
+      </w:r>
+      <w:r>
+        <w:t xml:space="preserve"> die x-Achse zwischen verstrichener Zeit und zurückgelegter Strecke entlang der Trajektorie um; die Wahl wird gemerkt. Bei „Strecke“ stehen die Uhrzeiten unter der Achse ungleichmäßig – dort, wo der Wind schneller oder langsamer trägt.</w:t>
+      </w:r>
+    </w:p>
+    <w:p>
+      <w:pPr>
+        <w:spacing w:after="120"/>
+      </w:pPr>
+      <w:r>
+        <w:t xml:space="preserve">Verlässt der Weg das Modellgebiet oder reicht er über das Ende des Vorhersagezeitraums hinaus, endet der Querschnitt dort mit einer roten, gestrichelten Markierung und dem Grund.</w:t>
       </w:r>
     </w:p>
     <w:p>

</xml_diff>

<commit_message>
Hindcast: Maussync Karte/Diagramme, verbreiterbares Panel, Einheiten
- Maus über GPS-Track/Modellspur oder Diagramm setzt den Zeitpunkt;
  Karte, Readout und die übrigen Diagramme (Linie + Tooltip) ziehen mit
- Bedienfeld per Ziehgriff bzw. ⇔-Knopf verbreiterbar, Diagramme wachsen mit
- Einheiten Höhe/Geschwindigkeit/Strecke (units.js um Strecke erweitert),
  Vorgabe aus der Vorhersageseite; CSV bleibt SI
- README und Bedienungsanleitung 8.3 nachgezogen

Co-Authored-By: Claude Opus 5.5 <noreply@anthropic.com>
</commit_message>
<xml_diff>
--- a/docs/Bedienungsanleitung-Windtrajektorien.docx
+++ b/docs/Bedienungsanleitung-Windtrajektorien.docx
@@ -3783,7 +3783,7 @@
         <w:t xml:space="preserve">„Zeitpunkt“</w:t>
       </w:r>
       <w:r>
-        <w:t xml:space="preserve"> gehen Sie die Fahrt durch und sehen für jeden Moment Ihre Geschwindigkeit, den Modellwind und den Abstand. Darunter zeigen drei Diagramme Abstand, Geschwindigkeit und Richtung über die Zeit. </w:t>
+        <w:t xml:space="preserve"> gehen Sie die Fahrt durch und sehen für jeden Moment Ihre Geschwindigkeit, den Modellwind und den Abstand. Darunter zeigen drei Diagramme Abstand, Geschwindigkeit und Richtung über die Zeit. Karte und Diagramme sind gekoppelt: Fahren Sie mit der Maus über Ihren Track oder eine Modellspur, springt der Zeitpunkt dorthin, und alle drei Diagramme zeigen die Werte dieses Moments an. Umgekehrt markiert die Maus über einem Diagramm die zugehörigen Positionen auf der Karte. Am Handy tippen Sie dafür auf die Spur. </w:t>
       </w:r>
       <w:r>
         <w:rPr>
@@ -3795,6 +3795,36 @@
       </w:r>
       <w:r>
         <w:t xml:space="preserve"> speichert alle Werte für eine Tabellenkalkulation.</w:t>
+      </w:r>
+    </w:p>
+    <w:p>
+      <w:pPr>
+        <w:spacing w:after="120"/>
+      </w:pPr>
+      <w:r>
+        <w:t xml:space="preserve">Ansicht anpassen: Am Desktop ziehen Sie das Bedienfeld am linken Rand breiter, oder Sie klicken auf </w:t>
+      </w:r>
+      <w:r>
+        <w:rPr>
+          <w:b/>
+          <w:bCs/>
+          <w:color w:val="0F6B63"/>
+        </w:rPr>
+        <w:t xml:space="preserve">„⇔“</w:t>
+      </w:r>
+      <w:r>
+        <w:t xml:space="preserve"> im Kopf. Die Diagramme wachsen dabei mit. Ein Doppelklick auf den Rand stellt die Standardbreite wieder her. Unter </w:t>
+      </w:r>
+      <w:r>
+        <w:rPr>
+          <w:b/>
+          <w:bCs/>
+          <w:color w:val="0F6B63"/>
+        </w:rPr>
+        <w:t xml:space="preserve">„Einheiten“</w:t>
+      </w:r>
+      <w:r>
+        <w:t xml:space="preserve"> wählen Sie Höhe (m oder ft), Geschwindigkeit (km/h, m/s oder kt) und Strecke (km, NM oder mi). Das gilt für Tabelle, Diagramme und Karte. Die CSV-Datei bleibt immer in Metern und m/s. Breite und Einheiten merkt sich der Browser. Solange Sie im Hindcast keine eigenen Einheiten gewählt haben, übernimmt er die der Vorhersageseite.</w:t>
       </w:r>
     </w:p>
     <w:p>

</xml_diff>